<commit_message>
Updated files from latest correction
</commit_message>
<xml_diff>
--- a/tables/aim_0.docx
+++ b/tables/aim_0.docx
@@ -5,12 +5,12 @@
     <w:tbl>
       <w:tblPr>
         <w:tblStyle w:val="Table"/>
-        <w:tblW w:type="pct" w:w="3958"/>
+        <w:tblW w:type="pct" w:w="3750"/>
         <w:tblLayout w:type="fixed"/>
         <w:tblLook w:firstRow="1" w:lastRow="1" w:firstColumn="0" w:lastColumn="0" w:noHBand="0" w:noVBand="0" w:val="0020"/>
       </w:tblPr>
       <w:tblGrid>
-        <w:gridCol w:w="4840"/>
+        <w:gridCol w:w="4510"/>
         <w:gridCol w:w="1430"/>
       </w:tblGrid>
       <w:tr>
@@ -30,7 +30,6 @@
           <w:p>
             <w:pPr>
               <w:pStyle w:val="Compact"/>
-              <w:jc w:val="left"/>
             </w:pPr>
             <w:r>
               <w:t xml:space="preserve">Full Model</w:t>
@@ -44,7 +43,6 @@
           <w:p>
             <w:pPr>
               <w:pStyle w:val="Compact"/>
-              <w:jc w:val="left"/>
             </w:pPr>
             <w:r>
               <w:t xml:space="preserve">(Intercept)</w:t>
@@ -56,29 +54,27 @@
           <w:p>
             <w:pPr>
               <w:pStyle w:val="Compact"/>
-              <w:jc w:val="left"/>
-            </w:pPr>
-            <w:r>
-              <w:t xml:space="preserve">0.347***</w:t>
-            </w:r>
-          </w:p>
-        </w:tc>
-      </w:tr>
-      <w:tr>
-        <w:tc>
-          <w:tcPr/>
-          <w:p>
-            <w:pPr>
-              <w:pStyle w:val="Compact"/>
-            </w:pPr>
-          </w:p>
-        </w:tc>
-        <w:tc>
-          <w:tcPr/>
-          <w:p>
-            <w:pPr>
-              <w:pStyle w:val="Compact"/>
-              <w:jc w:val="left"/>
+            </w:pPr>
+            <w:r>
+              <w:t xml:space="preserve">0.258***</w:t>
+            </w:r>
+          </w:p>
+        </w:tc>
+      </w:tr>
+      <w:tr>
+        <w:tc>
+          <w:tcPr/>
+          <w:p>
+            <w:pPr>
+              <w:pStyle w:val="Compact"/>
+            </w:pPr>
+          </w:p>
+        </w:tc>
+        <w:tc>
+          <w:tcPr/>
+          <w:p>
+            <w:pPr>
+              <w:pStyle w:val="Compact"/>
             </w:pPr>
             <w:r>
               <w:t xml:space="preserve">(0.001)</w:t>
@@ -92,7 +88,6 @@
           <w:p>
             <w:pPr>
               <w:pStyle w:val="Compact"/>
-              <w:jc w:val="left"/>
             </w:pPr>
             <w:r>
               <w:t xml:space="preserve">categoryPseudo Dyads</w:t>
@@ -104,29 +99,27 @@
           <w:p>
             <w:pPr>
               <w:pStyle w:val="Compact"/>
-              <w:jc w:val="left"/>
-            </w:pPr>
-            <w:r>
-              <w:t xml:space="preserve">-0.004***</w:t>
-            </w:r>
-          </w:p>
-        </w:tc>
-      </w:tr>
-      <w:tr>
-        <w:tc>
-          <w:tcPr/>
-          <w:p>
-            <w:pPr>
-              <w:pStyle w:val="Compact"/>
-            </w:pPr>
-          </w:p>
-        </w:tc>
-        <w:tc>
-          <w:tcPr/>
-          <w:p>
-            <w:pPr>
-              <w:pStyle w:val="Compact"/>
-              <w:jc w:val="left"/>
+            </w:pPr>
+            <w:r>
+              <w:t xml:space="preserve">-0.003***</w:t>
+            </w:r>
+          </w:p>
+        </w:tc>
+      </w:tr>
+      <w:tr>
+        <w:tc>
+          <w:tcPr/>
+          <w:p>
+            <w:pPr>
+              <w:pStyle w:val="Compact"/>
+            </w:pPr>
+          </w:p>
+        </w:tc>
+        <w:tc>
+          <w:tcPr/>
+          <w:p>
+            <w:pPr>
+              <w:pStyle w:val="Compact"/>
             </w:pPr>
             <w:r>
               <w:t xml:space="preserve">(0.001)</w:t>
@@ -140,175 +133,89 @@
           <w:p>
             <w:pPr>
               <w:pStyle w:val="Compact"/>
-              <w:jc w:val="left"/>
-            </w:pPr>
-            <w:r>
-              <w:t xml:space="preserve">SD (Intercept record_id)</w:t>
-            </w:r>
-          </w:p>
-        </w:tc>
-        <w:tc>
-          <w:tcPr/>
-          <w:p>
-            <w:pPr>
-              <w:pStyle w:val="Compact"/>
-              <w:jc w:val="left"/>
-            </w:pPr>
-            <w:r>
-              <w:t xml:space="preserve">0.007</w:t>
-            </w:r>
-          </w:p>
-        </w:tc>
-      </w:tr>
-      <w:tr>
-        <w:tc>
-          <w:tcPr/>
-          <w:p>
-            <w:pPr>
-              <w:pStyle w:val="Compact"/>
-              <w:jc w:val="left"/>
-            </w:pPr>
-            <w:r>
-              <w:t xml:space="preserve">SD (blockBlock 2 record_id)</w:t>
-            </w:r>
-          </w:p>
-        </w:tc>
-        <w:tc>
-          <w:tcPr/>
-          <w:p>
-            <w:pPr>
-              <w:pStyle w:val="Compact"/>
-              <w:jc w:val="left"/>
-            </w:pPr>
-            <w:r>
-              <w:t xml:space="preserve">0.026</w:t>
-            </w:r>
-          </w:p>
-        </w:tc>
-      </w:tr>
-      <w:tr>
-        <w:tc>
-          <w:tcPr/>
-          <w:p>
-            <w:pPr>
-              <w:pStyle w:val="Compact"/>
-              <w:jc w:val="left"/>
-            </w:pPr>
-            <w:r>
-              <w:t xml:space="preserve">SD (blockBlock 3 record_id)</w:t>
-            </w:r>
-          </w:p>
-        </w:tc>
-        <w:tc>
-          <w:tcPr/>
-          <w:p>
-            <w:pPr>
-              <w:pStyle w:val="Compact"/>
-              <w:jc w:val="left"/>
-            </w:pPr>
-            <w:r>
-              <w:t xml:space="preserve">0.006</w:t>
-            </w:r>
-          </w:p>
-        </w:tc>
-      </w:tr>
-      <w:tr>
-        <w:tc>
-          <w:tcPr/>
-          <w:p>
-            <w:pPr>
-              <w:pStyle w:val="Compact"/>
-              <w:jc w:val="left"/>
-            </w:pPr>
-            <w:r>
-              <w:t xml:space="preserve">Cor (Intercept~blockBlock 2 record_id)</w:t>
-            </w:r>
-          </w:p>
-        </w:tc>
-        <w:tc>
-          <w:tcPr/>
-          <w:p>
-            <w:pPr>
-              <w:pStyle w:val="Compact"/>
-              <w:jc w:val="left"/>
-            </w:pPr>
-            <w:r>
-              <w:t xml:space="preserve">-0.873</w:t>
-            </w:r>
-          </w:p>
-        </w:tc>
-      </w:tr>
-      <w:tr>
-        <w:tc>
-          <w:tcPr/>
-          <w:p>
-            <w:pPr>
-              <w:pStyle w:val="Compact"/>
-              <w:jc w:val="left"/>
-            </w:pPr>
-            <w:r>
-              <w:t xml:space="preserve">Cor (Intercept~blockBlock 3 record_id)</w:t>
-            </w:r>
-          </w:p>
-        </w:tc>
-        <w:tc>
-          <w:tcPr/>
-          <w:p>
-            <w:pPr>
-              <w:pStyle w:val="Compact"/>
-              <w:jc w:val="left"/>
-            </w:pPr>
-            <w:r>
-              <w:t xml:space="preserve">-0.348</w:t>
-            </w:r>
-          </w:p>
-        </w:tc>
-      </w:tr>
-      <w:tr>
-        <w:tc>
-          <w:tcPr/>
-          <w:p>
-            <w:pPr>
-              <w:pStyle w:val="Compact"/>
-              <w:jc w:val="left"/>
-            </w:pPr>
-            <w:r>
-              <w:t xml:space="preserve">Cor (blockBlock 2~blockBlock 3 record_id)</w:t>
-            </w:r>
-          </w:p>
-        </w:tc>
-        <w:tc>
-          <w:tcPr/>
-          <w:p>
-            <w:pPr>
-              <w:pStyle w:val="Compact"/>
-              <w:jc w:val="left"/>
-            </w:pPr>
-            <w:r>
-              <w:t xml:space="preserve">0.091</w:t>
-            </w:r>
-          </w:p>
-        </w:tc>
-      </w:tr>
-      <w:tr>
-        <w:tc>
-          <w:tcPr/>
-          <w:p>
-            <w:pPr>
-              <w:pStyle w:val="Compact"/>
-              <w:jc w:val="left"/>
-            </w:pPr>
-            <w:r>
-              <w:t xml:space="preserve">SD (Intercept trial)</w:t>
-            </w:r>
-          </w:p>
-        </w:tc>
-        <w:tc>
-          <w:tcPr/>
-          <w:p>
-            <w:pPr>
-              <w:pStyle w:val="Compact"/>
-              <w:jc w:val="left"/>
+            </w:pPr>
+            <w:r>
+              <w:t xml:space="preserve">SD (Intercept new_id)</w:t>
+            </w:r>
+          </w:p>
+        </w:tc>
+        <w:tc>
+          <w:tcPr/>
+          <w:p>
+            <w:pPr>
+              <w:pStyle w:val="Compact"/>
+            </w:pPr>
+            <w:r>
+              <w:t xml:space="preserve">0.005</w:t>
+            </w:r>
+          </w:p>
+        </w:tc>
+      </w:tr>
+      <w:tr>
+        <w:tc>
+          <w:tcPr/>
+          <w:p>
+            <w:pPr>
+              <w:pStyle w:val="Compact"/>
+            </w:pPr>
+            <w:r>
+              <w:t xml:space="preserve">SD (blockBlock 2 new_id)</w:t>
+            </w:r>
+          </w:p>
+        </w:tc>
+        <w:tc>
+          <w:tcPr/>
+          <w:p>
+            <w:pPr>
+              <w:pStyle w:val="Compact"/>
+            </w:pPr>
+            <w:r>
+              <w:t xml:space="preserve">0.003</w:t>
+            </w:r>
+          </w:p>
+        </w:tc>
+      </w:tr>
+      <w:tr>
+        <w:tc>
+          <w:tcPr/>
+          <w:p>
+            <w:pPr>
+              <w:pStyle w:val="Compact"/>
+            </w:pPr>
+            <w:r>
+              <w:t xml:space="preserve">SD (blockBlock 3 new_id)</w:t>
+            </w:r>
+          </w:p>
+        </w:tc>
+        <w:tc>
+          <w:tcPr/>
+          <w:p>
+            <w:pPr>
+              <w:pStyle w:val="Compact"/>
+            </w:pPr>
+            <w:r>
+              <w:t xml:space="preserve">0.003</w:t>
+            </w:r>
+          </w:p>
+        </w:tc>
+      </w:tr>
+      <w:tr>
+        <w:tc>
+          <w:tcPr/>
+          <w:p>
+            <w:pPr>
+              <w:pStyle w:val="Compact"/>
+            </w:pPr>
+            <w:r>
+              <w:t xml:space="preserve">SD (trial_num new_id)</w:t>
+            </w:r>
+          </w:p>
+        </w:tc>
+        <w:tc>
+          <w:tcPr/>
+          <w:p>
+            <w:pPr>
+              <w:pStyle w:val="Compact"/>
             </w:pPr>
             <w:r>
               <w:t xml:space="preserve">0.001</w:t>
@@ -322,7 +229,150 @@
           <w:p>
             <w:pPr>
               <w:pStyle w:val="Compact"/>
-              <w:jc w:val="left"/>
+            </w:pPr>
+            <w:r>
+              <w:t xml:space="preserve">Cor (Intercept~blockBlock 2 new_id)</w:t>
+            </w:r>
+          </w:p>
+        </w:tc>
+        <w:tc>
+          <w:tcPr/>
+          <w:p>
+            <w:pPr>
+              <w:pStyle w:val="Compact"/>
+            </w:pPr>
+            <w:r>
+              <w:t xml:space="preserve">-0.358</w:t>
+            </w:r>
+          </w:p>
+        </w:tc>
+      </w:tr>
+      <w:tr>
+        <w:tc>
+          <w:tcPr/>
+          <w:p>
+            <w:pPr>
+              <w:pStyle w:val="Compact"/>
+            </w:pPr>
+            <w:r>
+              <w:t xml:space="preserve">Cor (Intercept~blockBlock 3 new_id)</w:t>
+            </w:r>
+          </w:p>
+        </w:tc>
+        <w:tc>
+          <w:tcPr/>
+          <w:p>
+            <w:pPr>
+              <w:pStyle w:val="Compact"/>
+            </w:pPr>
+            <w:r>
+              <w:t xml:space="preserve">-0.576</w:t>
+            </w:r>
+          </w:p>
+        </w:tc>
+      </w:tr>
+      <w:tr>
+        <w:tc>
+          <w:tcPr/>
+          <w:p>
+            <w:pPr>
+              <w:pStyle w:val="Compact"/>
+            </w:pPr>
+            <w:r>
+              <w:t xml:space="preserve">Cor (Intercept~trial_num new_id)</w:t>
+            </w:r>
+          </w:p>
+        </w:tc>
+        <w:tc>
+          <w:tcPr/>
+          <w:p>
+            <w:pPr>
+              <w:pStyle w:val="Compact"/>
+            </w:pPr>
+            <w:r>
+              <w:t xml:space="preserve">-0.702</w:t>
+            </w:r>
+          </w:p>
+        </w:tc>
+      </w:tr>
+      <w:tr>
+        <w:tc>
+          <w:tcPr/>
+          <w:p>
+            <w:pPr>
+              <w:pStyle w:val="Compact"/>
+            </w:pPr>
+            <w:r>
+              <w:t xml:space="preserve">Cor (blockBlock 2~blockBlock 3 new_id)</w:t>
+            </w:r>
+          </w:p>
+        </w:tc>
+        <w:tc>
+          <w:tcPr/>
+          <w:p>
+            <w:pPr>
+              <w:pStyle w:val="Compact"/>
+            </w:pPr>
+            <w:r>
+              <w:t xml:space="preserve">0.808</w:t>
+            </w:r>
+          </w:p>
+        </w:tc>
+      </w:tr>
+      <w:tr>
+        <w:tc>
+          <w:tcPr/>
+          <w:p>
+            <w:pPr>
+              <w:pStyle w:val="Compact"/>
+            </w:pPr>
+            <w:r>
+              <w:t xml:space="preserve">Cor (blockBlock 2~trial_num new_id)</w:t>
+            </w:r>
+          </w:p>
+        </w:tc>
+        <w:tc>
+          <w:tcPr/>
+          <w:p>
+            <w:pPr>
+              <w:pStyle w:val="Compact"/>
+            </w:pPr>
+            <w:r>
+              <w:t xml:space="preserve">-0.268</w:t>
+            </w:r>
+          </w:p>
+        </w:tc>
+      </w:tr>
+      <w:tr>
+        <w:tc>
+          <w:tcPr/>
+          <w:p>
+            <w:pPr>
+              <w:pStyle w:val="Compact"/>
+            </w:pPr>
+            <w:r>
+              <w:t xml:space="preserve">Cor (blockBlock 3~trial_num new_id)</w:t>
+            </w:r>
+          </w:p>
+        </w:tc>
+        <w:tc>
+          <w:tcPr/>
+          <w:p>
+            <w:pPr>
+              <w:pStyle w:val="Compact"/>
+            </w:pPr>
+            <w:r>
+              <w:t xml:space="preserve">-0.178</w:t>
+            </w:r>
+          </w:p>
+        </w:tc>
+      </w:tr>
+      <w:tr>
+        <w:tc>
+          <w:tcPr/>
+          <w:p>
+            <w:pPr>
+              <w:pStyle w:val="Compact"/>
             </w:pPr>
             <w:r>
               <w:t xml:space="preserve">SD (Observations)</w:t>
@@ -334,21 +384,19 @@
           <w:p>
             <w:pPr>
               <w:pStyle w:val="Compact"/>
-              <w:jc w:val="left"/>
-            </w:pPr>
-            <w:r>
-              <w:t xml:space="preserve">0.034</w:t>
-            </w:r>
-          </w:p>
-        </w:tc>
-      </w:tr>
-      <w:tr>
-        <w:tc>
-          <w:tcPr/>
-          <w:p>
-            <w:pPr>
-              <w:pStyle w:val="Compact"/>
-              <w:jc w:val="left"/>
+            </w:pPr>
+            <w:r>
+              <w:t xml:space="preserve">0.029</w:t>
+            </w:r>
+          </w:p>
+        </w:tc>
+      </w:tr>
+      <w:tr>
+        <w:tc>
+          <w:tcPr/>
+          <w:p>
+            <w:pPr>
+              <w:pStyle w:val="Compact"/>
             </w:pPr>
             <w:r>
               <w:t xml:space="preserve">Num.Obs.</w:t>
@@ -360,21 +408,19 @@
           <w:p>
             <w:pPr>
               <w:pStyle w:val="Compact"/>
-              <w:jc w:val="left"/>
-            </w:pPr>
-            <w:r>
-              <w:t xml:space="preserve">141451</w:t>
-            </w:r>
-          </w:p>
-        </w:tc>
-      </w:tr>
-      <w:tr>
-        <w:tc>
-          <w:tcPr/>
-          <w:p>
-            <w:pPr>
-              <w:pStyle w:val="Compact"/>
-              <w:jc w:val="left"/>
+            </w:pPr>
+            <w:r>
+              <w:t xml:space="preserve">141324</w:t>
+            </w:r>
+          </w:p>
+        </w:tc>
+      </w:tr>
+      <w:tr>
+        <w:tc>
+          <w:tcPr/>
+          <w:p>
+            <w:pPr>
+              <w:pStyle w:val="Compact"/>
             </w:pPr>
             <w:r>
               <w:t xml:space="preserve">R2 Marg.</w:t>
@@ -386,7 +432,6 @@
           <w:p>
             <w:pPr>
               <w:pStyle w:val="Compact"/>
-              <w:jc w:val="left"/>
             </w:pPr>
             <w:r>
               <w:t xml:space="preserve">0.000</w:t>
@@ -400,33 +445,6 @@
           <w:p>
             <w:pPr>
               <w:pStyle w:val="Compact"/>
-              <w:jc w:val="left"/>
-            </w:pPr>
-            <w:r>
-              <w:t xml:space="preserve">R2 Cond.</w:t>
-            </w:r>
-          </w:p>
-        </w:tc>
-        <w:tc>
-          <w:tcPr/>
-          <w:p>
-            <w:pPr>
-              <w:pStyle w:val="Compact"/>
-              <w:jc w:val="left"/>
-            </w:pPr>
-            <w:r>
-              <w:t xml:space="preserve">0.045</w:t>
-            </w:r>
-          </w:p>
-        </w:tc>
-      </w:tr>
-      <w:tr>
-        <w:tc>
-          <w:tcPr/>
-          <w:p>
-            <w:pPr>
-              <w:pStyle w:val="Compact"/>
-              <w:jc w:val="left"/>
             </w:pPr>
             <w:r>
               <w:t xml:space="preserve">AIC</w:t>
@@ -438,21 +456,19 @@
           <w:p>
             <w:pPr>
               <w:pStyle w:val="Compact"/>
-              <w:jc w:val="left"/>
-            </w:pPr>
-            <w:r>
-              <w:t xml:space="preserve">-557586.4</w:t>
-            </w:r>
-          </w:p>
-        </w:tc>
-      </w:tr>
-      <w:tr>
-        <w:tc>
-          <w:tcPr/>
-          <w:p>
-            <w:pPr>
-              <w:pStyle w:val="Compact"/>
-              <w:jc w:val="left"/>
+            </w:pPr>
+            <w:r>
+              <w:t xml:space="preserve">-594242.6</w:t>
+            </w:r>
+          </w:p>
+        </w:tc>
+      </w:tr>
+      <w:tr>
+        <w:tc>
+          <w:tcPr/>
+          <w:p>
+            <w:pPr>
+              <w:pStyle w:val="Compact"/>
             </w:pPr>
             <w:r>
               <w:t xml:space="preserve">BIC</w:t>
@@ -464,21 +480,19 @@
           <w:p>
             <w:pPr>
               <w:pStyle w:val="Compact"/>
-              <w:jc w:val="left"/>
-            </w:pPr>
-            <w:r>
-              <w:t xml:space="preserve">-557487.8</w:t>
-            </w:r>
-          </w:p>
-        </w:tc>
-      </w:tr>
-      <w:tr>
-        <w:tc>
-          <w:tcPr/>
-          <w:p>
-            <w:pPr>
-              <w:pStyle w:val="Compact"/>
-              <w:jc w:val="left"/>
+            </w:pPr>
+            <w:r>
+              <w:t xml:space="preserve">-594114.4</w:t>
+            </w:r>
+          </w:p>
+        </w:tc>
+      </w:tr>
+      <w:tr>
+        <w:tc>
+          <w:tcPr/>
+          <w:p>
+            <w:pPr>
+              <w:pStyle w:val="Compact"/>
             </w:pPr>
             <w:r>
               <w:t xml:space="preserve">RMSE</w:t>
@@ -490,7 +504,6 @@
           <w:p>
             <w:pPr>
               <w:pStyle w:val="Compact"/>
-              <w:jc w:val="left"/>
             </w:pPr>
             <w:r>
               <w:t xml:space="preserve">0.03</w:t>
@@ -510,7 +523,6 @@
                 <w:ilvl w:val="0"/>
                 <w:numId w:val="1001"/>
               </w:numPr>
-              <w:jc w:val="left"/>
             </w:pPr>
             <w:r>
               <w:t xml:space="preserve">p &lt; 0.1, * p &lt; 0.05, ** p &lt; 0.01, *** p &lt; 0.001</w:t>
@@ -519,7 +531,11 @@
         </w:tc>
       </w:tr>
     </w:tbl>
-    <w:sectPr/>
+    <w:sectPr>
+      <w:footnotePr>
+        <w:numRestart w:val="eachSect"/>
+      </w:footnotePr>
+    </w:sectPr>
   </w:body>
 </w:document>
 </file>
@@ -797,8 +813,6 @@
     </w:pPr>
     <w:rPr>
       <w:rFonts w:asciiTheme="majorHAnsi" w:cstheme="majorBidi" w:eastAsiaTheme="majorEastAsia" w:hAnsiTheme="majorHAnsi"/>
-      <w:spacing w:val="-10"/>
-      <w:kern w:val="28"/>
       <w:sz w:val="56"/>
       <w:szCs w:val="56"/>
     </w:rPr>
@@ -811,15 +825,13 @@
     <w:rsid w:val="00A10FD9"/>
     <w:rPr>
       <w:rFonts w:asciiTheme="majorHAnsi" w:cstheme="majorBidi" w:eastAsiaTheme="majorEastAsia" w:hAnsiTheme="majorHAnsi"/>
-      <w:spacing w:val="-10"/>
-      <w:kern w:val="28"/>
       <w:sz w:val="56"/>
       <w:szCs w:val="56"/>
     </w:rPr>
   </w:style>
   <w:style w:styleId="Subtitle" w:type="paragraph">
     <w:name w:val="Subtitle"/>
-    <w:basedOn w:val="Normal"/>
+    <w:basedOn w:val="Title"/>
     <w:next w:val="BodyText"/>
     <w:link w:val="SubtitleChar"/>
     <w:uiPriority w:val="11"/>
@@ -830,6 +842,19 @@
         <w:ilvl w:val="1"/>
       </w:numPr>
     </w:pPr>
+    <w:rPr>
+      <w:rFonts w:cstheme="majorBidi" w:eastAsiaTheme="majorEastAsia"/>
+      <w:spacing w:val="15"/>
+      <w:sz w:val="28"/>
+      <w:szCs w:val="28"/>
+    </w:rPr>
+  </w:style>
+  <w:style w:customStyle="1" w:styleId="SubtitleChar" w:type="character">
+    <w:name w:val="Subtitle Char"/>
+    <w:basedOn w:val="DefaultParagraphFont"/>
+    <w:link w:val="Subtitle"/>
+    <w:uiPriority w:val="11"/>
+    <w:rsid w:val="00A10FD9"/>
     <w:rPr>
       <w:rFonts w:cstheme="majorBidi" w:eastAsiaTheme="majorEastAsia"/>
       <w:color w:themeColor="text1" w:themeTint="A6" w:val="595959"/>
@@ -838,39 +863,33 @@
       <w:szCs w:val="28"/>
     </w:rPr>
   </w:style>
-  <w:style w:customStyle="1" w:styleId="SubtitleChar" w:type="character">
-    <w:name w:val="Subtitle Char"/>
-    <w:basedOn w:val="DefaultParagraphFont"/>
-    <w:link w:val="Subtitle"/>
-    <w:uiPriority w:val="11"/>
-    <w:rsid w:val="00A10FD9"/>
-    <w:rPr>
-      <w:rFonts w:cstheme="majorBidi" w:eastAsiaTheme="majorEastAsia"/>
-      <w:color w:themeColor="text1" w:themeTint="A6" w:val="595959"/>
-      <w:spacing w:val="15"/>
-      <w:sz w:val="28"/>
-      <w:szCs w:val="28"/>
-    </w:rPr>
-  </w:style>
   <w:style w:customStyle="1" w:styleId="Author" w:type="paragraph">
     <w:name w:val="Author"/>
+    <w:basedOn w:val="Title"/>
     <w:next w:val="BodyText"/>
     <w:qFormat/>
     <w:pPr>
       <w:keepNext/>
       <w:keepLines/>
-      <w:jc w:val="center"/>
-    </w:pPr>
+    </w:pPr>
+    <w:rPr>
+      <w:sz w:val="24"/>
+      <w:szCs w:val="24"/>
+    </w:rPr>
   </w:style>
   <w:style w:styleId="Date" w:type="paragraph">
     <w:name w:val="Date"/>
+    <w:basedOn w:val="Title"/>
     <w:next w:val="BodyText"/>
     <w:qFormat/>
     <w:pPr>
       <w:keepNext/>
       <w:keepLines/>
-      <w:jc w:val="center"/>
-    </w:pPr>
+    </w:pPr>
+    <w:rPr>
+      <w:sz w:val="24"/>
+      <w:szCs w:val="24"/>
+    </w:rPr>
   </w:style>
   <w:style w:customStyle="1" w:styleId="AbstractTitle" w:type="paragraph">
     <w:name w:val="Abstract Title"/>
@@ -885,7 +904,6 @@
     </w:pPr>
     <w:rPr>
       <w:b/>
-      <w:color w:val="345A8A"/>
       <w:sz w:val="20"/>
       <w:szCs w:val="20"/>
     </w:rPr>

</xml_diff>